<commit_message>
Upload product documentation docx files
</commit_message>
<xml_diff>
--- a/产品总体设计文档.docx
+++ b/产品总体设计文档.docx
@@ -192,12 +192,6 @@
             <w:insideH w:val="single" w:color="auto" w:sz="4" w:space="0"/>
             <w:insideV w:val="single" w:color="auto" w:sz="4" w:space="0"/>
           </w:tblBorders>
-          <w:tblCellMar>
-            <w:top w:w="0" w:type="dxa"/>
-            <w:left w:w="108" w:type="dxa"/>
-            <w:bottom w:w="0" w:type="dxa"/>
-            <w:right w:w="108" w:type="dxa"/>
-          </w:tblCellMar>
         </w:tblPrEx>
         <w:trPr>
           <w:jc w:val="center"/>
@@ -1277,9 +1271,28 @@
         </w:tc>
       </w:tr>
       <w:tr>
+        <w:tblPrEx>
+          <w:tblBorders>
+            <w:top w:val="single" w:color="auto" w:sz="4" w:space="0"/>
+            <w:left w:val="single" w:color="auto" w:sz="4" w:space="0"/>
+            <w:bottom w:val="single" w:color="auto" w:sz="4" w:space="0"/>
+            <w:right w:val="single" w:color="auto" w:sz="4" w:space="0"/>
+            <w:insideH w:val="single" w:color="auto" w:sz="4" w:space="0"/>
+            <w:insideV w:val="single" w:color="auto" w:sz="4" w:space="0"/>
+          </w:tblBorders>
+          <w:tblCellMar>
+            <w:top w:w="0" w:type="dxa"/>
+            <w:left w:w="108" w:type="dxa"/>
+            <w:bottom w:w="0" w:type="dxa"/>
+            <w:right w:w="108" w:type="dxa"/>
+          </w:tblCellMar>
+        </w:tblPrEx>
+        <w:trPr>
+          <w:jc w:val="center"/>
+        </w:trPr>
         <w:tc>
           <w:tcPr>
-            <w:tcW w:type="dxa" w:w="648"/>
+            <w:tcW w:w="648" w:type="dxa"/>
           </w:tcPr>
           <w:p>
             <w:r>
@@ -1289,7 +1302,7 @@
         </w:tc>
         <w:tc>
           <w:tcPr>
-            <w:tcW w:type="dxa" w:w="936"/>
+            <w:tcW w:w="936" w:type="dxa"/>
           </w:tcPr>
           <w:p>
             <w:r>
@@ -1299,7 +1312,7 @@
         </w:tc>
         <w:tc>
           <w:tcPr>
-            <w:tcW w:type="dxa" w:w="1224"/>
+            <w:tcW w:w="1224" w:type="dxa"/>
           </w:tcPr>
           <w:p>
             <w:r>
@@ -1309,7 +1322,7 @@
         </w:tc>
         <w:tc>
           <w:tcPr>
-            <w:tcW w:type="dxa" w:w="1080"/>
+            <w:tcW w:w="1080" w:type="dxa"/>
           </w:tcPr>
           <w:p>
             <w:r>
@@ -1319,7 +1332,7 @@
         </w:tc>
         <w:tc>
           <w:tcPr>
-            <w:tcW w:type="dxa" w:w="1080"/>
+            <w:tcW w:w="1080" w:type="dxa"/>
           </w:tcPr>
           <w:p>
             <w:r>
@@ -1329,7 +1342,7 @@
         </w:tc>
         <w:tc>
           <w:tcPr>
-            <w:tcW w:type="dxa" w:w="1080"/>
+            <w:tcW w:w="1080" w:type="dxa"/>
           </w:tcPr>
           <w:p>
             <w:r>
@@ -1339,11 +1352,11 @@
         </w:tc>
         <w:tc>
           <w:tcPr>
-            <w:tcW w:type="dxa" w:w="3168"/>
+            <w:tcW w:w="3168" w:type="dxa"/>
           </w:tcPr>
           <w:p>
             <w:r>
-              <w:t>补充多 Agent 语义规划、最终审核 LLM 与最新 1200 题评测结果</w:t>
+              <w:t>补充多 Agent 语义规划</w:t>
             </w:r>
           </w:p>
         </w:tc>
@@ -1359,7 +1372,7 @@
         <w:spacing w:after="80" w:line="300" w:lineRule="auto"/>
       </w:pPr>
       <w:r>
-        <w:t>当前使用版本：V1.6。本文以当前工程实现、本轮多 Agent 语义规划、最终审核 LLM 改造和 reports/full1200_multi_agent_review.json 可核验评测报告为依据。</w:t>
+        <w:t>当前使用版本：V1.6。</w:t>
       </w:r>
     </w:p>
     <w:p>
@@ -3816,6 +3829,12 @@
             <w:insideH w:val="single" w:color="auto" w:sz="4" w:space="0"/>
             <w:insideV w:val="single" w:color="auto" w:sz="4" w:space="0"/>
           </w:tblBorders>
+          <w:tblCellMar>
+            <w:top w:w="0" w:type="dxa"/>
+            <w:left w:w="108" w:type="dxa"/>
+            <w:bottom w:w="0" w:type="dxa"/>
+            <w:right w:w="108" w:type="dxa"/>
+          </w:tblCellMar>
         </w:tblPrEx>
         <w:trPr>
           <w:jc w:val="center"/>
@@ -4326,9 +4345,9 @@
         </w:tblCellMar>
       </w:tblPr>
       <w:tblGrid>
-        <w:gridCol w:w="1800"/>
-        <w:gridCol w:w="4248"/>
-        <w:gridCol w:w="3312"/>
+        <w:gridCol w:w="1763"/>
+        <w:gridCol w:w="4174"/>
+        <w:gridCol w:w="3740"/>
       </w:tblGrid>
       <w:tr>
         <w:tblPrEx>
@@ -4791,15 +4810,35 @@
       </w:pPr>
       <w:r>
         <w:t>游客 / 管理员</w:t>
-        <w:br/>
+      </w:r>
+      <w:r>
+        <w:br w:type="textWrapping"/>
+      </w:r>
+      <w:r>
         <w:t xml:space="preserve">  -&gt; 多模态交互层：React 前台、管理后台、语音输入、数字人视频、conversation_context</w:t>
-        <w:br/>
+      </w:r>
+      <w:r>
+        <w:br w:type="textWrapping"/>
+      </w:r>
+      <w:r>
         <w:t xml:space="preserve">  -&gt; 服务编排层：FastAPI、短期会话记忆、日志、ASR/TTS、数字人生成、弱 GPS 会话</w:t>
-        <w:br/>
+      </w:r>
+      <w:r>
+        <w:br w:type="textWrapping"/>
+      </w:r>
+      <w:r>
         <w:t xml:space="preserve">  -&gt; Agent 工具循环层：主 Agent、专业语义规划子 Agent、ToolRunner、AgentLoopController、answer_review</w:t>
-        <w:br/>
+      </w:r>
+      <w:r>
+        <w:br w:type="textWrapping"/>
+      </w:r>
+      <w:r>
         <w:t xml:space="preserve">  -&gt; 确定性执行层：structured_fact、hybrid_rag、behavior_sql、route_planner、response_contract</w:t>
-        <w:br/>
+      </w:r>
+      <w:r>
+        <w:br w:type="textWrapping"/>
+      </w:r>
+      <w:r>
         <w:t xml:space="preserve">  -&gt; 数据与证据层：SQLite 事实表、游客行为库、ChromaDB、DOCX 知识片段、评测报告</w:t>
       </w:r>
     </w:p>
@@ -5431,12 +5470,6 @@
             <w:insideH w:val="single" w:color="auto" w:sz="4" w:space="0"/>
             <w:insideV w:val="single" w:color="auto" w:sz="4" w:space="0"/>
           </w:tblBorders>
-          <w:tblCellMar>
-            <w:top w:w="0" w:type="dxa"/>
-            <w:left w:w="108" w:type="dxa"/>
-            <w:bottom w:w="0" w:type="dxa"/>
-            <w:right w:w="108" w:type="dxa"/>
-          </w:tblCellMar>
         </w:tblPrEx>
         <w:trPr>
           <w:jc w:val="center"/>
@@ -7313,9 +7346,25 @@
         </w:tc>
       </w:tr>
       <w:tr>
+        <w:tblPrEx>
+          <w:tblBorders>
+            <w:top w:val="single" w:color="auto" w:sz="4" w:space="0"/>
+            <w:left w:val="single" w:color="auto" w:sz="4" w:space="0"/>
+            <w:bottom w:val="single" w:color="auto" w:sz="4" w:space="0"/>
+            <w:right w:val="single" w:color="auto" w:sz="4" w:space="0"/>
+            <w:insideH w:val="single" w:color="auto" w:sz="4" w:space="0"/>
+            <w:insideV w:val="single" w:color="auto" w:sz="4" w:space="0"/>
+          </w:tblBorders>
+          <w:tblCellMar>
+            <w:top w:w="0" w:type="dxa"/>
+            <w:left w:w="108" w:type="dxa"/>
+            <w:bottom w:w="0" w:type="dxa"/>
+            <w:right w:w="108" w:type="dxa"/>
+          </w:tblCellMar>
+        </w:tblPrEx>
         <w:tc>
           <w:tcPr>
-            <w:tcW w:type="dxa" w:w="1773"/>
+            <w:tcW w:w="1773" w:type="dxa"/>
           </w:tcPr>
           <w:p>
             <w:r>
@@ -7325,7 +7374,7 @@
         </w:tc>
         <w:tc>
           <w:tcPr>
-            <w:tcW w:type="dxa" w:w="2644"/>
+            <w:tcW w:w="2644" w:type="dxa"/>
           </w:tcPr>
           <w:p>
             <w:r>
@@ -7335,7 +7384,7 @@
         </w:tc>
         <w:tc>
           <w:tcPr>
-            <w:tcW w:type="dxa" w:w="2655"/>
+            <w:tcW w:w="2655" w:type="dxa"/>
           </w:tcPr>
           <w:p>
             <w:r>
@@ -7345,7 +7394,7 @@
         </w:tc>
         <w:tc>
           <w:tcPr>
-            <w:tcW w:type="dxa" w:w="2605"/>
+            <w:tcW w:w="2605" w:type="dxa"/>
           </w:tcPr>
           <w:p>
             <w:r>
@@ -7360,7 +7409,6 @@
         <w:t>执行时，工具返回的 ToolObservation 包含 status、confidence、response_kind、evidence、refusal、missing_slots、suggested_next_tools 和 trace。pipeline 生成候选答案后交给最终审核 LLM；审核只返回 approved、issues、risk_level 和 repair_action，不生成替代答案。若审核未通过，repair_action 仅作为提示，主 Agent 重新选择并调用同类或其他专业子 Agent 修复，再进入下一轮审核。</w:t>
       </w:r>
     </w:p>
-    <w:bookmarkEnd w:id="29"/>
     <w:p>
       <w:pPr>
         <w:rPr>
@@ -8171,7 +8219,6 @@
       </w:r>
     </w:p>
     <w:p>
-      <w:pPr/>
       <w:r>
         <w:t>9. log service 将 plan/evidence/refusal/warnings/observability 及 tools、agent_loop、answer_review、answer_review_repair trace 持久化到交互日志。</w:t>
       </w:r>
@@ -8214,7 +8261,6 @@
         </w:rPr>
         <w:t xml:space="preserve"> 统一响应契约</w:t>
       </w:r>
-      <w:bookmarkEnd w:id="12"/>
     </w:p>
     <w:p>
       <w:pPr>
@@ -8443,7 +8489,7 @@
       </w:r>
     </w:p>
     <w:p>
-      <w:bookmarkStart w:id="13" w:name="_Toc7320"/>
+      <w:bookmarkStart w:id="12" w:name="_Toc7320"/>
     </w:p>
     <w:p>
       <w:pPr>
@@ -8461,7 +8507,7 @@
         </w:rPr>
         <w:t>3.6 API、会话上下文与日志可观测性</w:t>
       </w:r>
-      <w:bookmarkEnd w:id="13"/>
+      <w:bookmarkEnd w:id="12"/>
     </w:p>
     <w:p>
       <w:r>
@@ -8504,12 +8550,6 @@
             <w:insideH w:val="single" w:color="auto" w:sz="4" w:space="0"/>
             <w:insideV w:val="single" w:color="auto" w:sz="4" w:space="0"/>
           </w:tblBorders>
-          <w:tblCellMar>
-            <w:top w:w="0" w:type="dxa"/>
-            <w:left w:w="108" w:type="dxa"/>
-            <w:bottom w:w="0" w:type="dxa"/>
-            <w:right w:w="108" w:type="dxa"/>
-          </w:tblCellMar>
         </w:tblPrEx>
         <w:trPr>
           <w:jc w:val="center"/>
@@ -9067,7 +9107,7 @@
         <w:keepNext/>
         <w:spacing w:before="160" w:after="120"/>
       </w:pPr>
-      <w:bookmarkStart w:id="14" w:name="_Toc15265"/>
+      <w:bookmarkStart w:id="13" w:name="_Toc15265"/>
       <w:r>
         <w:rPr>
           <w:rFonts w:ascii="微软雅黑" w:hAnsi="微软雅黑" w:eastAsia="微软雅黑" w:cs="微软雅黑"/>
@@ -9099,7 +9139,7 @@
         </w:rPr>
         <w:t xml:space="preserve"> 游客前台设计</w:t>
       </w:r>
-      <w:bookmarkEnd w:id="14"/>
+      <w:bookmarkEnd w:id="13"/>
     </w:p>
     <w:p>
       <w:pPr>
@@ -9164,7 +9204,7 @@
         </w:rPr>
         <w:t>路线入口：可通过园区规划页或预设路线卡片进入数字人导览。</w:t>
       </w:r>
-      <w:bookmarkStart w:id="15" w:name="_Toc1059"/>
+      <w:bookmarkStart w:id="14" w:name="_Toc1059"/>
     </w:p>
     <w:p>
       <w:pPr>
@@ -9315,7 +9355,7 @@
         </w:rPr>
         <w:t xml:space="preserve"> 管理后台设计</w:t>
       </w:r>
-      <w:bookmarkEnd w:id="15"/>
+      <w:bookmarkEnd w:id="14"/>
     </w:p>
     <w:p>
       <w:pPr>
@@ -10024,7 +10064,7 @@
           <w:sz w:val="26"/>
         </w:rPr>
       </w:pPr>
-      <w:bookmarkStart w:id="16" w:name="_Toc29431"/>
+      <w:bookmarkStart w:id="15" w:name="_Toc29431"/>
     </w:p>
     <w:p>
       <w:pPr>
@@ -10063,20 +10103,315 @@
         </w:rPr>
         <w:t xml:space="preserve"> 语音与数字人链路</w:t>
       </w:r>
+      <w:bookmarkEnd w:id="15"/>
+    </w:p>
+    <w:p>
+      <w:pPr>
+        <w:spacing w:after="40" w:line="288" w:lineRule="auto"/>
+      </w:pPr>
+      <w:r>
+        <w:rPr>
+          <w:rFonts w:ascii="微软雅黑" w:hAnsi="微软雅黑" w:eastAsia="微软雅黑" w:cs="微软雅黑"/>
+          <w:i w:val="0"/>
+          <w:sz w:val="21"/>
+        </w:rPr>
+        <w:t>1. 前台通过 getUserMedia + MediaRecorder 录制 `.webm` 音频。</w:t>
+      </w:r>
+    </w:p>
+    <w:p>
+      <w:pPr>
+        <w:spacing w:after="40" w:line="288" w:lineRule="auto"/>
+      </w:pPr>
+      <w:r>
+        <w:rPr>
+          <w:rFonts w:ascii="微软雅黑" w:hAnsi="微软雅黑" w:eastAsia="微软雅黑" w:cs="微软雅黑"/>
+          <w:i w:val="0"/>
+          <w:sz w:val="21"/>
+        </w:rPr>
+        <w:t>2. 浏览器上传到 `/api/v1/interact/audio`，后端使用 imageio-ffmpeg 解码。</w:t>
+      </w:r>
+    </w:p>
+    <w:p>
+      <w:pPr>
+        <w:spacing w:after="40" w:line="288" w:lineRule="auto"/>
+      </w:pPr>
+      <w:r>
+        <w:rPr>
+          <w:rFonts w:ascii="微软雅黑" w:hAnsi="微软雅黑" w:eastAsia="微软雅黑" w:cs="微软雅黑"/>
+          <w:i w:val="0"/>
+          <w:sz w:val="21"/>
+        </w:rPr>
+        <w:t>3. Whisper 完成 ASR，得到用户文本。</w:t>
+      </w:r>
+    </w:p>
+    <w:p>
+      <w:pPr>
+        <w:spacing w:after="40" w:line="288" w:lineRule="auto"/>
+      </w:pPr>
+      <w:r>
+        <w:t>4. 文本进入多 Agent 工具循环 pipeline，完成语义规划、确定性执行、最终审核和必要修复，生成答案、结构化元数据和工具 trace。</w:t>
+      </w:r>
+    </w:p>
+    <w:p>
+      <w:pPr>
+        <w:spacing w:after="40" w:line="288" w:lineRule="auto"/>
+      </w:pPr>
+      <w:r>
+        <w:rPr>
+          <w:rFonts w:ascii="微软雅黑" w:hAnsi="微软雅黑" w:eastAsia="微软雅黑" w:cs="微软雅黑"/>
+          <w:i w:val="0"/>
+          <w:sz w:val="21"/>
+        </w:rPr>
+        <w:t>5. Edge-TTS 合成语音，SoulX-FlashHead 生成视频或流式帧。</w:t>
+      </w:r>
+    </w:p>
+    <w:p>
+      <w:pPr>
+        <w:spacing w:after="40" w:line="288" w:lineRule="auto"/>
+        <w:rPr>
+          <w:rFonts w:ascii="微软雅黑" w:hAnsi="微软雅黑" w:eastAsia="微软雅黑" w:cs="微软雅黑"/>
+          <w:i w:val="0"/>
+          <w:sz w:val="21"/>
+        </w:rPr>
+      </w:pPr>
+      <w:r>
+        <w:rPr>
+          <w:rFonts w:ascii="微软雅黑" w:hAnsi="微软雅黑" w:eastAsia="微软雅黑" w:cs="微软雅黑"/>
+          <w:i w:val="0"/>
+          <w:sz w:val="21"/>
+        </w:rPr>
+        <w:t>6. 前台播放音频/视频，并保存本轮会话。</w:t>
+      </w:r>
+    </w:p>
+    <w:p>
+      <w:pPr>
+        <w:spacing w:after="40" w:line="288" w:lineRule="auto"/>
+        <w:rPr>
+          <w:rFonts w:ascii="微软雅黑" w:hAnsi="微软雅黑" w:eastAsia="微软雅黑" w:cs="微软雅黑"/>
+          <w:i w:val="0"/>
+          <w:sz w:val="21"/>
+        </w:rPr>
+      </w:pPr>
+    </w:p>
+    <w:p>
+      <w:pPr>
+        <w:spacing w:after="40" w:line="288" w:lineRule="auto"/>
+        <w:rPr>
+          <w:rFonts w:hint="eastAsia" w:ascii="微软雅黑" w:hAnsi="微软雅黑" w:eastAsia="微软雅黑" w:cs="微软雅黑"/>
+          <w:i w:val="0"/>
+          <w:sz w:val="21"/>
+          <w:lang w:eastAsia="zh-CN"/>
+        </w:rPr>
+      </w:pPr>
+      <w:r>
+        <w:rPr>
+          <w:rFonts w:hint="eastAsia" w:cs="微软雅黑"/>
+          <w:i w:val="0"/>
+          <w:sz w:val="21"/>
+          <w:lang w:val="en-US" w:eastAsia="zh-CN"/>
+        </w:rPr>
+        <w:t>故</w:t>
+      </w:r>
+      <w:r>
+        <w:rPr>
+          <w:rFonts w:hint="eastAsia" w:ascii="微软雅黑" w:hAnsi="微软雅黑" w:eastAsia="微软雅黑" w:cs="微软雅黑"/>
+          <w:i w:val="0"/>
+          <w:sz w:val="21"/>
+        </w:rPr>
+        <w:t>数字人支持实时生成和稳定生成两种模式</w:t>
+      </w:r>
+      <w:r>
+        <w:rPr>
+          <w:rFonts w:hint="eastAsia" w:cs="微软雅黑"/>
+          <w:i w:val="0"/>
+          <w:sz w:val="21"/>
+          <w:lang w:eastAsia="zh-CN"/>
+        </w:rPr>
+        <w:t>。</w:t>
+      </w:r>
+    </w:p>
+    <w:p>
+      <w:pPr>
+        <w:spacing w:after="40" w:line="288" w:lineRule="auto"/>
+        <w:rPr>
+          <w:rFonts w:hint="eastAsia" w:cs="微软雅黑"/>
+          <w:i w:val="0"/>
+          <w:sz w:val="21"/>
+          <w:lang w:val="en-US" w:eastAsia="zh-CN"/>
+        </w:rPr>
+      </w:pPr>
+      <w:r>
+        <w:rPr>
+          <w:rFonts w:hint="eastAsia" w:ascii="微软雅黑" w:hAnsi="微软雅黑" w:eastAsia="微软雅黑" w:cs="微软雅黑"/>
+          <w:i w:val="0"/>
+          <w:sz w:val="21"/>
+        </w:rPr>
+        <w:t>流式生成</w:t>
+      </w:r>
+      <w:r>
+        <w:rPr>
+          <w:rFonts w:hint="eastAsia" w:cs="微软雅黑"/>
+          <w:i w:val="0"/>
+          <w:sz w:val="21"/>
+          <w:lang w:eastAsia="zh-CN"/>
+        </w:rPr>
+        <w:t>：</w:t>
+      </w:r>
+      <w:r>
+        <w:rPr>
+          <w:rFonts w:hint="eastAsia" w:ascii="微软雅黑" w:hAnsi="微软雅黑" w:eastAsia="微软雅黑" w:cs="微软雅黑"/>
+          <w:i w:val="0"/>
+          <w:sz w:val="21"/>
+        </w:rPr>
+        <w:t>分段tts，</w:t>
+      </w:r>
+      <w:r>
+        <w:rPr>
+          <w:rFonts w:hint="eastAsia" w:cs="微软雅黑"/>
+          <w:i w:val="0"/>
+          <w:sz w:val="21"/>
+          <w:lang w:val="en-US" w:eastAsia="zh-CN"/>
+        </w:rPr>
+        <w:t>再运行</w:t>
+      </w:r>
+      <w:r>
+        <w:rPr>
+          <w:rFonts w:hint="eastAsia" w:ascii="微软雅黑" w:hAnsi="微软雅黑" w:eastAsia="微软雅黑" w:cs="微软雅黑"/>
+          <w:i w:val="0"/>
+          <w:sz w:val="21"/>
+        </w:rPr>
+        <w:t>数字人，</w:t>
+      </w:r>
+      <w:r>
+        <w:rPr>
+          <w:rFonts w:hint="eastAsia" w:cs="微软雅黑"/>
+          <w:i w:val="0"/>
+          <w:sz w:val="21"/>
+          <w:lang w:val="en-US" w:eastAsia="zh-CN"/>
+        </w:rPr>
+        <w:t>以达到</w:t>
+      </w:r>
+      <w:r>
+        <w:rPr>
+          <w:rFonts w:hint="eastAsia" w:ascii="微软雅黑" w:hAnsi="微软雅黑" w:eastAsia="微软雅黑" w:cs="微软雅黑"/>
+          <w:i w:val="0"/>
+          <w:sz w:val="21"/>
+        </w:rPr>
+        <w:t>降低显存的压力</w:t>
+      </w:r>
+      <w:r>
+        <w:rPr>
+          <w:rFonts w:hint="eastAsia" w:cs="微软雅黑"/>
+          <w:i w:val="0"/>
+          <w:sz w:val="21"/>
+          <w:lang w:val="en-US" w:eastAsia="zh-CN"/>
+        </w:rPr>
+        <w:t>的目的</w:t>
+      </w:r>
+    </w:p>
+    <w:p>
+      <w:pPr>
+        <w:spacing w:after="40" w:line="288" w:lineRule="auto"/>
+        <w:rPr>
+          <w:rFonts w:hint="eastAsia" w:cs="微软雅黑"/>
+          <w:i w:val="0"/>
+          <w:sz w:val="21"/>
+          <w:lang w:val="en-US" w:eastAsia="zh-CN"/>
+        </w:rPr>
+      </w:pPr>
+    </w:p>
+    <w:p>
+      <w:pPr>
+        <w:spacing w:after="40" w:line="288" w:lineRule="auto"/>
+        <w:rPr>
+          <w:rFonts w:hint="eastAsia" w:cs="微软雅黑"/>
+          <w:i w:val="0"/>
+          <w:sz w:val="21"/>
+          <w:lang w:val="en-US" w:eastAsia="zh-CN"/>
+        </w:rPr>
+      </w:pPr>
+    </w:p>
+    <w:p>
+      <w:pPr>
+        <w:spacing w:after="40" w:line="288" w:lineRule="auto"/>
+        <w:rPr>
+          <w:rFonts w:hint="eastAsia" w:cs="微软雅黑"/>
+          <w:i w:val="0"/>
+          <w:sz w:val="21"/>
+          <w:lang w:val="en-US" w:eastAsia="zh-CN"/>
+        </w:rPr>
+      </w:pPr>
+    </w:p>
+    <w:p>
+      <w:pPr>
+        <w:spacing w:after="40" w:line="288" w:lineRule="auto"/>
+        <w:rPr>
+          <w:rFonts w:hint="eastAsia" w:cs="微软雅黑"/>
+          <w:i w:val="0"/>
+          <w:sz w:val="21"/>
+          <w:lang w:val="en-US" w:eastAsia="zh-CN"/>
+        </w:rPr>
+      </w:pPr>
+    </w:p>
+    <w:p>
+      <w:pPr>
+        <w:spacing w:after="40" w:line="288" w:lineRule="auto"/>
+        <w:rPr>
+          <w:rFonts w:hint="eastAsia" w:cs="微软雅黑"/>
+          <w:i w:val="0"/>
+          <w:sz w:val="21"/>
+          <w:lang w:val="en-US" w:eastAsia="zh-CN"/>
+        </w:rPr>
+      </w:pPr>
+    </w:p>
+    <w:p>
+      <w:pPr>
+        <w:spacing w:after="40" w:line="288" w:lineRule="auto"/>
+        <w:rPr>
+          <w:rFonts w:hint="eastAsia" w:cs="微软雅黑"/>
+          <w:i w:val="0"/>
+          <w:sz w:val="21"/>
+          <w:lang w:val="en-US" w:eastAsia="zh-CN"/>
+        </w:rPr>
+      </w:pPr>
+    </w:p>
+    <w:p>
+      <w:pPr>
+        <w:pStyle w:val="3"/>
+        <w:keepNext/>
+        <w:spacing w:before="240" w:after="120"/>
+      </w:pPr>
+      <w:bookmarkStart w:id="16" w:name="_Toc25053"/>
+      <w:r>
+        <w:rPr>
+          <w:rFonts w:ascii="微软雅黑" w:hAnsi="微软雅黑" w:eastAsia="微软雅黑" w:cs="微软雅黑"/>
+          <w:b/>
+          <w:i w:val="0"/>
+          <w:color w:val="1F4E79"/>
+          <w:sz w:val="32"/>
+        </w:rPr>
+        <w:t>4. 关键场景设计</w:t>
+      </w:r>
       <w:bookmarkEnd w:id="16"/>
     </w:p>
     <w:p>
       <w:pPr>
-        <w:spacing w:after="40" w:line="288" w:lineRule="auto"/>
-      </w:pPr>
+        <w:pStyle w:val="4"/>
+        <w:keepNext/>
+        <w:spacing w:before="160" w:after="120"/>
+      </w:pPr>
+      <w:bookmarkStart w:id="17" w:name="_Toc26041"/>
       <w:r>
         <w:rPr>
           <w:rFonts w:ascii="微软雅黑" w:hAnsi="微软雅黑" w:eastAsia="微软雅黑" w:cs="微软雅黑"/>
-          <w:i w:val="0"/>
-          <w:sz w:val="21"/>
-        </w:rPr>
-        <w:t>1. 前台通过 getUserMedia + MediaRecorder 录制 `.webm` 音频。</w:t>
-      </w:r>
+          <w:b/>
+          <w:i w:val="0"/>
+          <w:color w:val="1F4E79"/>
+          <w:sz w:val="26"/>
+        </w:rPr>
+        <w:t>4.1 首次游览导览</w:t>
+      </w:r>
+      <w:bookmarkEnd w:id="17"/>
     </w:p>
     <w:p>
       <w:pPr>
@@ -10088,7 +10423,7 @@
           <w:i w:val="0"/>
           <w:sz w:val="21"/>
         </w:rPr>
-        <w:t>2. 浏览器上传到 `/api/v1/interact/audio`，后端使用 imageio-ffmpeg 解码。</w:t>
+        <w:t>1. 游客进入前台或路线规划页，选择园区、兴趣偏好、游玩时长和节奏。</w:t>
       </w:r>
     </w:p>
     <w:p>
@@ -10101,7 +10436,7 @@
           <w:i w:val="0"/>
           <w:sz w:val="21"/>
         </w:rPr>
-        <w:t>3. Whisper 完成 ASR，得到用户文本。</w:t>
+        <w:t>2. 系统生成路线标题、适合原因、节点顺序、预计时长和讲解重点。</w:t>
       </w:r>
     </w:p>
     <w:p>
@@ -10109,7 +10444,12 @@
         <w:spacing w:after="40" w:line="288" w:lineRule="auto"/>
       </w:pPr>
       <w:r>
-        <w:t>4. 文本进入多 Agent 工具循环 pipeline，完成语义规划、确定性执行、最终审核和必要修复，生成答案、结构化元数据和工具 trace。</w:t>
+        <w:rPr>
+          <w:rFonts w:ascii="微软雅黑" w:hAnsi="微软雅黑" w:eastAsia="微软雅黑" w:cs="微软雅黑"/>
+          <w:i w:val="0"/>
+          <w:sz w:val="21"/>
+        </w:rPr>
+        <w:t>3. 游客点击“开始导览”进入数字人页面，当前路线语境会随请求传入。</w:t>
       </w:r>
     </w:p>
     <w:p>
@@ -10122,218 +10462,240 @@
           <w:i w:val="0"/>
           <w:sz w:val="21"/>
         </w:rPr>
-        <w:t>5. Edge-TTS 合成语音，SoulX-FlashHead 生成视频或流式帧。</w:t>
+        <w:t>4. 导览过程中，游客可继续追问某一站点的历史背景、拍照点或下一站建议。</w:t>
       </w:r>
     </w:p>
     <w:p>
       <w:pPr>
-        <w:spacing w:after="40" w:line="288" w:lineRule="auto"/>
+        <w:pStyle w:val="4"/>
+        <w:keepNext/>
+        <w:spacing w:before="160" w:after="120"/>
+      </w:pPr>
+      <w:bookmarkStart w:id="18" w:name="_Toc8302"/>
+      <w:r>
         <w:rPr>
           <w:rFonts w:ascii="微软雅黑" w:hAnsi="微软雅黑" w:eastAsia="微软雅黑" w:cs="微软雅黑"/>
-          <w:i w:val="0"/>
-          <w:sz w:val="21"/>
-        </w:rPr>
-      </w:pPr>
-      <w:r>
-        <w:rPr>
-          <w:rFonts w:ascii="微软雅黑" w:hAnsi="微软雅黑" w:eastAsia="微软雅黑" w:cs="微软雅黑"/>
-          <w:i w:val="0"/>
-          <w:sz w:val="21"/>
-        </w:rPr>
-        <w:t>6. 前台播放音频/视频，并保存本轮会话。</w:t>
-      </w:r>
+          <w:b/>
+          <w:i w:val="0"/>
+          <w:color w:val="1F4E79"/>
+          <w:sz w:val="26"/>
+        </w:rPr>
+        <w:t>4.2 景点深度讲解</w:t>
+      </w:r>
+      <w:bookmarkEnd w:id="18"/>
     </w:p>
     <w:p>
       <w:pPr>
         <w:spacing w:after="40" w:line="288" w:lineRule="auto"/>
+      </w:pPr>
+      <w:r>
         <w:rPr>
           <w:rFonts w:ascii="微软雅黑" w:hAnsi="微软雅黑" w:eastAsia="微软雅黑" w:cs="微软雅黑"/>
           <w:i w:val="0"/>
           <w:sz w:val="21"/>
         </w:rPr>
-      </w:pPr>
+        <w:t>1. 游客语音提问“灵山大佛有多高？”</w:t>
+      </w:r>
     </w:p>
     <w:p>
       <w:pPr>
         <w:spacing w:after="40" w:line="288" w:lineRule="auto"/>
-        <w:rPr>
-          <w:rFonts w:hint="eastAsia" w:ascii="微软雅黑" w:hAnsi="微软雅黑" w:eastAsia="微软雅黑" w:cs="微软雅黑"/>
-          <w:i w:val="0"/>
-          <w:sz w:val="21"/>
-          <w:lang w:eastAsia="zh-CN"/>
-        </w:rPr>
-      </w:pPr>
-      <w:r>
-        <w:rPr>
-          <w:rFonts w:hint="eastAsia" w:cs="微软雅黑"/>
-          <w:i w:val="0"/>
-          <w:sz w:val="21"/>
-          <w:lang w:val="en-US" w:eastAsia="zh-CN"/>
-        </w:rPr>
-        <w:t>故</w:t>
-      </w:r>
-      <w:r>
-        <w:rPr>
-          <w:rFonts w:hint="eastAsia" w:ascii="微软雅黑" w:hAnsi="微软雅黑" w:eastAsia="微软雅黑" w:cs="微软雅黑"/>
-          <w:i w:val="0"/>
-          <w:sz w:val="21"/>
-        </w:rPr>
-        <w:t>数字人支持实时生成和稳定生成两种模式</w:t>
-      </w:r>
-      <w:r>
-        <w:rPr>
-          <w:rFonts w:hint="eastAsia" w:cs="微软雅黑"/>
-          <w:i w:val="0"/>
-          <w:sz w:val="21"/>
-          <w:lang w:eastAsia="zh-CN"/>
-        </w:rPr>
-        <w:t>。</w:t>
+      </w:pPr>
+      <w:r>
+        <w:t>2. ASR 转文本后，QueryPlanner 选择 structured_fact 作为首步工具，事实子 Agent 识别景点和问题类型。</w:t>
       </w:r>
     </w:p>
     <w:p>
       <w:pPr>
         <w:spacing w:after="40" w:line="288" w:lineRule="auto"/>
-        <w:rPr>
-          <w:rFonts w:hint="eastAsia" w:cs="微软雅黑"/>
-          <w:i w:val="0"/>
-          <w:sz w:val="21"/>
-          <w:lang w:val="en-US" w:eastAsia="zh-CN"/>
-        </w:rPr>
-      </w:pPr>
-      <w:r>
-        <w:rPr>
-          <w:rFonts w:hint="eastAsia" w:ascii="微软雅黑" w:hAnsi="微软雅黑" w:eastAsia="微软雅黑" w:cs="微软雅黑"/>
-          <w:i w:val="0"/>
-          <w:sz w:val="21"/>
-        </w:rPr>
-        <w:t>流式生成</w:t>
-      </w:r>
-      <w:r>
-        <w:rPr>
-          <w:rFonts w:hint="eastAsia" w:cs="微软雅黑"/>
-          <w:i w:val="0"/>
-          <w:sz w:val="21"/>
-          <w:lang w:eastAsia="zh-CN"/>
-        </w:rPr>
-        <w:t>：</w:t>
-      </w:r>
-      <w:r>
-        <w:rPr>
-          <w:rFonts w:hint="eastAsia" w:ascii="微软雅黑" w:hAnsi="微软雅黑" w:eastAsia="微软雅黑" w:cs="微软雅黑"/>
-          <w:i w:val="0"/>
-          <w:sz w:val="21"/>
-        </w:rPr>
-        <w:t>分段tts，</w:t>
-      </w:r>
-      <w:r>
-        <w:rPr>
-          <w:rFonts w:hint="eastAsia" w:cs="微软雅黑"/>
-          <w:i w:val="0"/>
-          <w:sz w:val="21"/>
-          <w:lang w:val="en-US" w:eastAsia="zh-CN"/>
-        </w:rPr>
-        <w:t>再运行</w:t>
-      </w:r>
-      <w:r>
-        <w:rPr>
-          <w:rFonts w:hint="eastAsia" w:ascii="微软雅黑" w:hAnsi="微软雅黑" w:eastAsia="微软雅黑" w:cs="微软雅黑"/>
-          <w:i w:val="0"/>
-          <w:sz w:val="21"/>
-        </w:rPr>
-        <w:t>数字人，</w:t>
-      </w:r>
-      <w:r>
-        <w:rPr>
-          <w:rFonts w:hint="eastAsia" w:cs="微软雅黑"/>
-          <w:i w:val="0"/>
-          <w:sz w:val="21"/>
-          <w:lang w:val="en-US" w:eastAsia="zh-CN"/>
-        </w:rPr>
-        <w:t>以达到</w:t>
-      </w:r>
-      <w:r>
-        <w:rPr>
-          <w:rFonts w:hint="eastAsia" w:ascii="微软雅黑" w:hAnsi="微软雅黑" w:eastAsia="微软雅黑" w:cs="微软雅黑"/>
-          <w:i w:val="0"/>
-          <w:sz w:val="21"/>
-        </w:rPr>
-        <w:t>降低显存的压力</w:t>
-      </w:r>
-      <w:r>
-        <w:rPr>
-          <w:rFonts w:hint="eastAsia" w:cs="微软雅黑"/>
-          <w:i w:val="0"/>
-          <w:sz w:val="21"/>
-          <w:lang w:val="en-US" w:eastAsia="zh-CN"/>
-        </w:rPr>
-        <w:t>的目的</w:t>
+      </w:pPr>
+      <w:r>
+        <w:t>3. ToolRunner 调用 structured_fact，确定性读取结构化事实字段，返回 ToolObservation。</w:t>
       </w:r>
     </w:p>
     <w:p>
       <w:pPr>
         <w:spacing w:after="40" w:line="288" w:lineRule="auto"/>
-        <w:rPr>
-          <w:rFonts w:hint="eastAsia" w:cs="微软雅黑"/>
-          <w:i w:val="0"/>
-          <w:sz w:val="21"/>
-          <w:lang w:val="en-US" w:eastAsia="zh-CN"/>
-        </w:rPr>
-      </w:pPr>
+      </w:pPr>
+      <w:r>
+        <w:t>4. 若 observation 或最终审核 LLM 提示证据不足、表达不自然或风险较高，主 Agent 可继续调用 hybrid_rag 补充检索片段。</w:t>
+      </w:r>
     </w:p>
     <w:p>
       <w:pPr>
         <w:spacing w:after="40" w:line="288" w:lineRule="auto"/>
-        <w:rPr>
-          <w:rFonts w:hint="eastAsia" w:cs="微软雅黑"/>
-          <w:i w:val="0"/>
-          <w:sz w:val="21"/>
-          <w:lang w:val="en-US" w:eastAsia="zh-CN"/>
-        </w:rPr>
-      </w:pPr>
+      </w:pPr>
+      <w:r>
+        <w:t>5. pipeline 在最终审核通过后返回回答和必要的工具状态，数字人用短文本进行语音视频讲解。</w:t>
+      </w:r>
     </w:p>
     <w:p>
       <w:pPr>
-        <w:spacing w:after="40" w:line="288" w:lineRule="auto"/>
-        <w:rPr>
-          <w:rFonts w:hint="eastAsia" w:cs="微软雅黑"/>
-          <w:i w:val="0"/>
-          <w:sz w:val="21"/>
-          <w:lang w:val="en-US" w:eastAsia="zh-CN"/>
-        </w:rPr>
-      </w:pPr>
+        <w:pStyle w:val="4"/>
+        <w:keepNext/>
+        <w:spacing w:before="160" w:after="120"/>
+      </w:pPr>
+      <w:bookmarkStart w:id="19" w:name="_Toc13732"/>
+      <w:r>
+        <w:rPr>
+          <w:rFonts w:ascii="微软雅黑" w:hAnsi="微软雅黑" w:eastAsia="微软雅黑" w:cs="微软雅黑"/>
+          <w:b/>
+          <w:i w:val="0"/>
+          <w:color w:val="1F4E79"/>
+          <w:sz w:val="26"/>
+        </w:rPr>
+        <w:t>4.3 弱 GPS 多轮问路</w:t>
+      </w:r>
+      <w:bookmarkEnd w:id="19"/>
     </w:p>
     <w:p>
       <w:pPr>
-        <w:spacing w:after="40" w:line="288" w:lineRule="auto"/>
-        <w:rPr>
-          <w:rFonts w:hint="eastAsia" w:cs="微软雅黑"/>
+        <w:spacing w:after="80" w:line="300" w:lineRule="auto"/>
+      </w:pPr>
+      <w:r>
+        <w:rPr>
+          <w:rFonts w:ascii="微软雅黑" w:hAnsi="微软雅黑" w:eastAsia="微软雅黑" w:cs="微软雅黑"/>
           <w:i w:val="0"/>
           <w:sz w:val="21"/>
-          <w:lang w:val="en-US" w:eastAsia="zh-CN"/>
-        </w:rPr>
-      </w:pPr>
+        </w:rPr>
+        <w:t>弱 GPS 场景的重点不是“已知当前位置后的普通导航”，而是定位不准时，通过游客描述的地标进行多轮澄清。</w:t>
+      </w:r>
     </w:p>
     <w:p>
       <w:pPr>
         <w:spacing w:after="40" w:line="288" w:lineRule="auto"/>
-        <w:rPr>
-          <w:rFonts w:hint="eastAsia" w:cs="微软雅黑"/>
+      </w:pPr>
+      <w:r>
+        <w:rPr>
+          <w:rFonts w:ascii="微软雅黑" w:hAnsi="微软雅黑" w:eastAsia="微软雅黑" w:cs="微软雅黑"/>
           <w:i w:val="0"/>
           <w:sz w:val="21"/>
-          <w:lang w:val="en-US" w:eastAsia="zh-CN"/>
-        </w:rPr>
-      </w:pPr>
+        </w:rPr>
+        <w:t>1. 游客开启弱 GPS 模式并提问：“我定位不准，只看到一座桥和很长的步道，下一站怎么走？”</w:t>
+      </w:r>
     </w:p>
     <w:p>
       <w:pPr>
         <w:spacing w:after="40" w:line="288" w:lineRule="auto"/>
-        <w:rPr>
-          <w:rFonts w:hint="eastAsia" w:cs="微软雅黑"/>
+      </w:pPr>
+      <w:r>
+        <w:rPr>
+          <w:rFonts w:ascii="微软雅黑" w:hAnsi="微软雅黑" w:eastAsia="微软雅黑" w:cs="微软雅黑"/>
           <w:i w:val="0"/>
           <w:sz w:val="21"/>
-          <w:lang w:val="en-US" w:eastAsia="zh-CN"/>
-        </w:rPr>
-      </w:pPr>
+        </w:rPr>
+        <w:t>2. 系统检测到弱 GPS 且需要地标信息，进入 `gps:awaiting_landmarks` 状态。</w:t>
+      </w:r>
+    </w:p>
+    <w:p>
+      <w:pPr>
+        <w:spacing w:after="40" w:line="288" w:lineRule="auto"/>
+      </w:pPr>
+      <w:r>
+        <w:rPr>
+          <w:rFonts w:ascii="微软雅黑" w:hAnsi="微软雅黑" w:eastAsia="微软雅黑" w:cs="微软雅黑"/>
+          <w:i w:val="0"/>
+          <w:sz w:val="21"/>
+        </w:rPr>
+        <w:t>3. 游客补充周边地标，location agent 根据结构化景点信息推断候选位置。</w:t>
+      </w:r>
+    </w:p>
+    <w:p>
+      <w:pPr>
+        <w:spacing w:after="40" w:line="288" w:lineRule="auto"/>
+      </w:pPr>
+      <w:r>
+        <w:rPr>
+          <w:rFonts w:ascii="微软雅黑" w:hAnsi="微软雅黑" w:eastAsia="微软雅黑" w:cs="微软雅黑"/>
+          <w:i w:val="0"/>
+          <w:sz w:val="21"/>
+        </w:rPr>
+        <w:t>4. 若候选位置有歧义，系统继续追问；若位置解析成功，则进入路线推荐或下一站建议。</w:t>
+      </w:r>
+    </w:p>
+    <w:p>
+      <w:pPr>
+        <w:spacing w:after="40" w:line="288" w:lineRule="auto"/>
+      </w:pPr>
+      <w:r>
+        <w:rPr>
+          <w:rFonts w:ascii="微软雅黑" w:hAnsi="微软雅黑" w:eastAsia="微软雅黑" w:cs="微软雅黑"/>
+          <w:i w:val="0"/>
+          <w:sz w:val="21"/>
+        </w:rPr>
+        <w:t>5. 返回结果包含 gps_state、gps_candidates、matched_attraction 和后续路线建议。</w:t>
+      </w:r>
+    </w:p>
+    <w:p>
+      <w:pPr>
+        <w:pStyle w:val="4"/>
+        <w:keepNext/>
+        <w:spacing w:before="160" w:after="120"/>
+      </w:pPr>
+      <w:bookmarkStart w:id="20" w:name="_Toc7534"/>
+      <w:r>
+        <w:rPr>
+          <w:rFonts w:ascii="微软雅黑" w:hAnsi="微软雅黑" w:eastAsia="微软雅黑" w:cs="微软雅黑"/>
+          <w:b/>
+          <w:i w:val="0"/>
+          <w:color w:val="1F4E79"/>
+          <w:sz w:val="26"/>
+        </w:rPr>
+        <w:t>4.4 管理后台运营分析</w:t>
+      </w:r>
+      <w:bookmarkEnd w:id="20"/>
+    </w:p>
+    <w:p>
+      <w:pPr>
+        <w:spacing w:after="40" w:line="288" w:lineRule="auto"/>
+      </w:pPr>
+      <w:r>
+        <w:rPr>
+          <w:rFonts w:ascii="微软雅黑" w:hAnsi="微软雅黑" w:eastAsia="微软雅黑" w:cs="微软雅黑"/>
+          <w:i w:val="0"/>
+          <w:sz w:val="21"/>
+        </w:rPr>
+        <w:t>1. 管理员登录后台，查看交互量、意图分布、推荐触发和知识库状态。</w:t>
+      </w:r>
+    </w:p>
+    <w:p>
+      <w:pPr>
+        <w:spacing w:after="40" w:line="288" w:lineRule="auto"/>
+      </w:pPr>
+      <w:r>
+        <w:rPr>
+          <w:rFonts w:ascii="微软雅黑" w:hAnsi="微软雅黑" w:eastAsia="微软雅黑" w:cs="微软雅黑"/>
+          <w:i w:val="0"/>
+          <w:sz w:val="21"/>
+        </w:rPr>
+        <w:t>2. 后台读取当前统一评测报告，显示分数、题量和失败样例数量。</w:t>
+      </w:r>
+    </w:p>
+    <w:p>
+      <w:pPr>
+        <w:spacing w:after="40" w:line="288" w:lineRule="auto"/>
+      </w:pPr>
+      <w:r>
+        <w:rPr>
+          <w:rFonts w:ascii="微软雅黑" w:hAnsi="微软雅黑" w:eastAsia="微软雅黑" w:cs="微软雅黑"/>
+          <w:i w:val="0"/>
+          <w:sz w:val="21"/>
+        </w:rPr>
+        <w:t>3. 若出现拒答或弱 GPS 歧义样例，管理员通过失败样例查看问题和执行路径。</w:t>
+      </w:r>
+    </w:p>
+    <w:p>
+      <w:pPr>
+        <w:spacing w:after="40" w:line="288" w:lineRule="auto"/>
+      </w:pPr>
+      <w:r>
+        <w:rPr>
+          <w:rFonts w:ascii="微软雅黑" w:hAnsi="微软雅黑" w:eastAsia="微软雅黑" w:cs="微软雅黑"/>
+          <w:i w:val="0"/>
+          <w:sz w:val="21"/>
+        </w:rPr>
+        <w:t>4. 知识库维护以“查看清单、运行构建命令、必要时调用上传接口”为主；当前版本不宣称已完成 PDF 报告导出。</w:t>
+      </w:r>
     </w:p>
     <w:p>
       <w:pPr>
@@ -10341,7 +10703,7 @@
         <w:keepNext/>
         <w:spacing w:before="240" w:after="120"/>
       </w:pPr>
-      <w:bookmarkStart w:id="17" w:name="_Toc25053"/>
+      <w:bookmarkStart w:id="21" w:name="_Toc18816"/>
       <w:r>
         <w:rPr>
           <w:rFonts w:ascii="微软雅黑" w:hAnsi="微软雅黑" w:eastAsia="微软雅黑" w:cs="微软雅黑"/>
@@ -10350,331 +10712,9 @@
           <w:color w:val="1F4E79"/>
           <w:sz w:val="32"/>
         </w:rPr>
-        <w:t>4. 关键场景设计</w:t>
-      </w:r>
-      <w:bookmarkEnd w:id="17"/>
-    </w:p>
-    <w:p>
-      <w:pPr>
-        <w:pStyle w:val="4"/>
-        <w:keepNext/>
-        <w:spacing w:before="160" w:after="120"/>
-      </w:pPr>
-      <w:bookmarkStart w:id="18" w:name="_Toc26041"/>
-      <w:r>
-        <w:rPr>
-          <w:rFonts w:ascii="微软雅黑" w:hAnsi="微软雅黑" w:eastAsia="微软雅黑" w:cs="微软雅黑"/>
-          <w:b/>
-          <w:i w:val="0"/>
-          <w:color w:val="1F4E79"/>
-          <w:sz w:val="26"/>
-        </w:rPr>
-        <w:t>4.1 首次游览导览</w:t>
-      </w:r>
-      <w:bookmarkEnd w:id="18"/>
-    </w:p>
-    <w:p>
-      <w:pPr>
-        <w:spacing w:after="40" w:line="288" w:lineRule="auto"/>
-      </w:pPr>
-      <w:r>
-        <w:rPr>
-          <w:rFonts w:ascii="微软雅黑" w:hAnsi="微软雅黑" w:eastAsia="微软雅黑" w:cs="微软雅黑"/>
-          <w:i w:val="0"/>
-          <w:sz w:val="21"/>
-        </w:rPr>
-        <w:t>1. 游客进入前台或路线规划页，选择园区、兴趣偏好、游玩时长和节奏。</w:t>
-      </w:r>
-    </w:p>
-    <w:p>
-      <w:pPr>
-        <w:spacing w:after="40" w:line="288" w:lineRule="auto"/>
-      </w:pPr>
-      <w:r>
-        <w:rPr>
-          <w:rFonts w:ascii="微软雅黑" w:hAnsi="微软雅黑" w:eastAsia="微软雅黑" w:cs="微软雅黑"/>
-          <w:i w:val="0"/>
-          <w:sz w:val="21"/>
-        </w:rPr>
-        <w:t>2. 系统生成路线标题、适合原因、节点顺序、预计时长和讲解重点。</w:t>
-      </w:r>
-    </w:p>
-    <w:p>
-      <w:pPr>
-        <w:spacing w:after="40" w:line="288" w:lineRule="auto"/>
-      </w:pPr>
-      <w:r>
-        <w:rPr>
-          <w:rFonts w:ascii="微软雅黑" w:hAnsi="微软雅黑" w:eastAsia="微软雅黑" w:cs="微软雅黑"/>
-          <w:i w:val="0"/>
-          <w:sz w:val="21"/>
-        </w:rPr>
-        <w:t>3. 游客点击“开始导览”进入数字人页面，当前路线语境会随请求传入。</w:t>
-      </w:r>
-    </w:p>
-    <w:p>
-      <w:pPr>
-        <w:spacing w:after="40" w:line="288" w:lineRule="auto"/>
-      </w:pPr>
-      <w:r>
-        <w:rPr>
-          <w:rFonts w:ascii="微软雅黑" w:hAnsi="微软雅黑" w:eastAsia="微软雅黑" w:cs="微软雅黑"/>
-          <w:i w:val="0"/>
-          <w:sz w:val="21"/>
-        </w:rPr>
-        <w:t>4. 导览过程中，游客可继续追问某一站点的历史背景、拍照点或下一站建议。</w:t>
-      </w:r>
-    </w:p>
-    <w:p>
-      <w:pPr>
-        <w:pStyle w:val="4"/>
-        <w:keepNext/>
-        <w:spacing w:before="160" w:after="120"/>
-      </w:pPr>
-      <w:bookmarkStart w:id="19" w:name="_Toc8302"/>
-      <w:r>
-        <w:rPr>
-          <w:rFonts w:ascii="微软雅黑" w:hAnsi="微软雅黑" w:eastAsia="微软雅黑" w:cs="微软雅黑"/>
-          <w:b/>
-          <w:i w:val="0"/>
-          <w:color w:val="1F4E79"/>
-          <w:sz w:val="26"/>
-        </w:rPr>
-        <w:t>4.2 景点深度讲解</w:t>
-      </w:r>
-      <w:bookmarkEnd w:id="19"/>
-    </w:p>
-    <w:p>
-      <w:pPr>
-        <w:spacing w:after="40" w:line="288" w:lineRule="auto"/>
-      </w:pPr>
-      <w:r>
-        <w:rPr>
-          <w:rFonts w:ascii="微软雅黑" w:hAnsi="微软雅黑" w:eastAsia="微软雅黑" w:cs="微软雅黑"/>
-          <w:i w:val="0"/>
-          <w:sz w:val="21"/>
-        </w:rPr>
-        <w:t>1. 游客语音提问“灵山大佛有多高？”</w:t>
-      </w:r>
-    </w:p>
-    <w:p>
-      <w:pPr>
-        <w:spacing w:after="40" w:line="288" w:lineRule="auto"/>
-      </w:pPr>
-      <w:r>
-        <w:t>2. ASR 转文本后，QueryPlanner 选择 structured_fact 作为首步工具，事实子 Agent 识别景点和问题类型。</w:t>
-      </w:r>
-    </w:p>
-    <w:p>
-      <w:pPr>
-        <w:spacing w:after="40" w:line="288" w:lineRule="auto"/>
-      </w:pPr>
-      <w:r>
-        <w:t>3. ToolRunner 调用 structured_fact，确定性读取结构化事实字段，返回 ToolObservation。</w:t>
-      </w:r>
-    </w:p>
-    <w:p>
-      <w:pPr>
-        <w:spacing w:after="40" w:line="288" w:lineRule="auto"/>
-      </w:pPr>
-      <w:r>
-        <w:t>4. 若 observation 或最终审核 LLM 提示证据不足、表达不自然或风险较高，主 Agent 可继续调用 hybrid_rag 补充检索片段。</w:t>
-      </w:r>
-    </w:p>
-    <w:p>
-      <w:pPr>
-        <w:spacing w:after="40" w:line="288" w:lineRule="auto"/>
-      </w:pPr>
-      <w:r>
-        <w:t>5. pipeline 在最终审核通过后返回回答和必要的工具状态，数字人用短文本进行语音视频讲解。</w:t>
-      </w:r>
-    </w:p>
-    <w:p>
-      <w:pPr>
-        <w:pStyle w:val="4"/>
-        <w:keepNext/>
-        <w:spacing w:before="160" w:after="120"/>
-      </w:pPr>
-      <w:bookmarkStart w:id="20" w:name="_Toc13732"/>
-      <w:r>
-        <w:rPr>
-          <w:rFonts w:ascii="微软雅黑" w:hAnsi="微软雅黑" w:eastAsia="微软雅黑" w:cs="微软雅黑"/>
-          <w:b/>
-          <w:i w:val="0"/>
-          <w:color w:val="1F4E79"/>
-          <w:sz w:val="26"/>
-        </w:rPr>
-        <w:t>4.3 弱 GPS 多轮问路</w:t>
-      </w:r>
-      <w:bookmarkEnd w:id="20"/>
-    </w:p>
-    <w:p>
-      <w:pPr>
-        <w:spacing w:after="80" w:line="300" w:lineRule="auto"/>
-      </w:pPr>
-      <w:r>
-        <w:rPr>
-          <w:rFonts w:ascii="微软雅黑" w:hAnsi="微软雅黑" w:eastAsia="微软雅黑" w:cs="微软雅黑"/>
-          <w:i w:val="0"/>
-          <w:sz w:val="21"/>
-        </w:rPr>
-        <w:t>弱 GPS 场景的重点不是“已知当前位置后的普通导航”，而是定位不准时，通过游客描述的地标进行多轮澄清。</w:t>
-      </w:r>
-    </w:p>
-    <w:p>
-      <w:pPr>
-        <w:spacing w:after="40" w:line="288" w:lineRule="auto"/>
-      </w:pPr>
-      <w:r>
-        <w:rPr>
-          <w:rFonts w:ascii="微软雅黑" w:hAnsi="微软雅黑" w:eastAsia="微软雅黑" w:cs="微软雅黑"/>
-          <w:i w:val="0"/>
-          <w:sz w:val="21"/>
-        </w:rPr>
-        <w:t>1. 游客开启弱 GPS 模式并提问：“我定位不准，只看到一座桥和很长的步道，下一站怎么走？”</w:t>
-      </w:r>
-    </w:p>
-    <w:p>
-      <w:pPr>
-        <w:spacing w:after="40" w:line="288" w:lineRule="auto"/>
-      </w:pPr>
-      <w:r>
-        <w:rPr>
-          <w:rFonts w:ascii="微软雅黑" w:hAnsi="微软雅黑" w:eastAsia="微软雅黑" w:cs="微软雅黑"/>
-          <w:i w:val="0"/>
-          <w:sz w:val="21"/>
-        </w:rPr>
-        <w:t>2. 系统检测到弱 GPS 且需要地标信息，进入 `gps:awaiting_landmarks` 状态。</w:t>
-      </w:r>
-    </w:p>
-    <w:p>
-      <w:pPr>
-        <w:spacing w:after="40" w:line="288" w:lineRule="auto"/>
-      </w:pPr>
-      <w:r>
-        <w:rPr>
-          <w:rFonts w:ascii="微软雅黑" w:hAnsi="微软雅黑" w:eastAsia="微软雅黑" w:cs="微软雅黑"/>
-          <w:i w:val="0"/>
-          <w:sz w:val="21"/>
-        </w:rPr>
-        <w:t>3. 游客补充周边地标，location agent 根据结构化景点信息推断候选位置。</w:t>
-      </w:r>
-    </w:p>
-    <w:p>
-      <w:pPr>
-        <w:spacing w:after="40" w:line="288" w:lineRule="auto"/>
-      </w:pPr>
-      <w:r>
-        <w:rPr>
-          <w:rFonts w:ascii="微软雅黑" w:hAnsi="微软雅黑" w:eastAsia="微软雅黑" w:cs="微软雅黑"/>
-          <w:i w:val="0"/>
-          <w:sz w:val="21"/>
-        </w:rPr>
-        <w:t>4. 若候选位置有歧义，系统继续追问；若位置解析成功，则进入路线推荐或下一站建议。</w:t>
-      </w:r>
-    </w:p>
-    <w:p>
-      <w:pPr>
-        <w:spacing w:after="40" w:line="288" w:lineRule="auto"/>
-      </w:pPr>
-      <w:r>
-        <w:rPr>
-          <w:rFonts w:ascii="微软雅黑" w:hAnsi="微软雅黑" w:eastAsia="微软雅黑" w:cs="微软雅黑"/>
-          <w:i w:val="0"/>
-          <w:sz w:val="21"/>
-        </w:rPr>
-        <w:t>5. 返回结果包含 gps_state、gps_candidates、matched_attraction 和后续路线建议。</w:t>
-      </w:r>
-    </w:p>
-    <w:p>
-      <w:pPr>
-        <w:pStyle w:val="4"/>
-        <w:keepNext/>
-        <w:spacing w:before="160" w:after="120"/>
-      </w:pPr>
-      <w:bookmarkStart w:id="21" w:name="_Toc7534"/>
-      <w:r>
-        <w:rPr>
-          <w:rFonts w:ascii="微软雅黑" w:hAnsi="微软雅黑" w:eastAsia="微软雅黑" w:cs="微软雅黑"/>
-          <w:b/>
-          <w:i w:val="0"/>
-          <w:color w:val="1F4E79"/>
-          <w:sz w:val="26"/>
-        </w:rPr>
-        <w:t>4.4 管理后台运营分析</w:t>
+        <w:t>5. 安全边界与限制</w:t>
       </w:r>
       <w:bookmarkEnd w:id="21"/>
-    </w:p>
-    <w:p>
-      <w:pPr>
-        <w:spacing w:after="40" w:line="288" w:lineRule="auto"/>
-      </w:pPr>
-      <w:r>
-        <w:rPr>
-          <w:rFonts w:ascii="微软雅黑" w:hAnsi="微软雅黑" w:eastAsia="微软雅黑" w:cs="微软雅黑"/>
-          <w:i w:val="0"/>
-          <w:sz w:val="21"/>
-        </w:rPr>
-        <w:t>1. 管理员登录后台，查看交互量、意图分布、推荐触发和知识库状态。</w:t>
-      </w:r>
-    </w:p>
-    <w:p>
-      <w:pPr>
-        <w:spacing w:after="40" w:line="288" w:lineRule="auto"/>
-      </w:pPr>
-      <w:r>
-        <w:rPr>
-          <w:rFonts w:ascii="微软雅黑" w:hAnsi="微软雅黑" w:eastAsia="微软雅黑" w:cs="微软雅黑"/>
-          <w:i w:val="0"/>
-          <w:sz w:val="21"/>
-        </w:rPr>
-        <w:t>2. 后台读取当前统一评测报告，显示分数、题量和失败样例数量。</w:t>
-      </w:r>
-    </w:p>
-    <w:p>
-      <w:pPr>
-        <w:spacing w:after="40" w:line="288" w:lineRule="auto"/>
-      </w:pPr>
-      <w:r>
-        <w:rPr>
-          <w:rFonts w:ascii="微软雅黑" w:hAnsi="微软雅黑" w:eastAsia="微软雅黑" w:cs="微软雅黑"/>
-          <w:i w:val="0"/>
-          <w:sz w:val="21"/>
-        </w:rPr>
-        <w:t>3. 若出现拒答或弱 GPS 歧义样例，管理员通过失败样例查看问题和执行路径。</w:t>
-      </w:r>
-    </w:p>
-    <w:p>
-      <w:pPr>
-        <w:spacing w:after="40" w:line="288" w:lineRule="auto"/>
-      </w:pPr>
-      <w:r>
-        <w:rPr>
-          <w:rFonts w:ascii="微软雅黑" w:hAnsi="微软雅黑" w:eastAsia="微软雅黑" w:cs="微软雅黑"/>
-          <w:i w:val="0"/>
-          <w:sz w:val="21"/>
-        </w:rPr>
-        <w:t>4. 知识库维护以“查看清单、运行构建命令、必要时调用上传接口”为主；当前版本不宣称已完成 PDF 报告导出。</w:t>
-      </w:r>
-    </w:p>
-    <w:p>
-      <w:pPr>
-        <w:pStyle w:val="3"/>
-        <w:keepNext/>
-        <w:spacing w:before="240" w:after="120"/>
-      </w:pPr>
-      <w:bookmarkStart w:id="22" w:name="_Toc18816"/>
-      <w:r>
-        <w:rPr>
-          <w:rFonts w:ascii="微软雅黑" w:hAnsi="微软雅黑" w:eastAsia="微软雅黑" w:cs="微软雅黑"/>
-          <w:b/>
-          <w:i w:val="0"/>
-          <w:color w:val="1F4E79"/>
-          <w:sz w:val="32"/>
-        </w:rPr>
-        <w:t>5. 安全边界与限制</w:t>
-      </w:r>
-      <w:bookmarkEnd w:id="22"/>
     </w:p>
     <w:p>
       <w:pPr>
@@ -11339,7 +11379,7 @@
         <w:keepNext/>
         <w:spacing w:before="240" w:after="120"/>
       </w:pPr>
-      <w:bookmarkStart w:id="23" w:name="_Toc19944"/>
+      <w:bookmarkStart w:id="22" w:name="_Toc19944"/>
       <w:r>
         <w:rPr>
           <w:rFonts w:ascii="微软雅黑" w:hAnsi="微软雅黑" w:eastAsia="微软雅黑" w:cs="微软雅黑"/>
@@ -11349,34 +11389,39 @@
           <w:sz w:val="32"/>
         </w:rPr>
         <w:t>6. 测试评测与交付状态</w:t>
+      </w:r>
+      <w:bookmarkEnd w:id="22"/>
+    </w:p>
+    <w:p>
+      <w:pPr>
+        <w:pStyle w:val="4"/>
+        <w:keepNext/>
+        <w:spacing w:before="160" w:after="120"/>
+      </w:pPr>
+      <w:bookmarkStart w:id="23" w:name="_Toc19968"/>
+      <w:r>
+        <w:rPr>
+          <w:rFonts w:ascii="微软雅黑" w:hAnsi="微软雅黑" w:eastAsia="微软雅黑" w:cs="微软雅黑"/>
+          <w:b/>
+          <w:i w:val="0"/>
+          <w:color w:val="1F4E79"/>
+          <w:sz w:val="26"/>
+        </w:rPr>
+        <w:t>6.1 评测集与当前报告口径</w:t>
       </w:r>
       <w:bookmarkEnd w:id="23"/>
     </w:p>
     <w:p>
       <w:pPr>
-        <w:pStyle w:val="4"/>
-        <w:keepNext/>
-        <w:spacing w:before="160" w:after="120"/>
-      </w:pPr>
-      <w:bookmarkStart w:id="24" w:name="_Toc19968"/>
-      <w:r>
-        <w:rPr>
-          <w:rFonts w:ascii="微软雅黑" w:hAnsi="微软雅黑" w:eastAsia="微软雅黑" w:cs="微软雅黑"/>
-          <w:b/>
-          <w:i w:val="0"/>
-          <w:color w:val="1F4E79"/>
-          <w:sz w:val="26"/>
-        </w:rPr>
-        <w:t>6.1 评测集与当前报告口径</w:t>
-      </w:r>
-      <w:bookmarkEnd w:id="24"/>
-    </w:p>
-    <w:p>
-      <w:pPr>
         <w:spacing w:after="80" w:line="300" w:lineRule="auto"/>
       </w:pPr>
       <w:r>
-        <w:t>项目中 `tests/unified_eval_cases.jsonl` 主评测集当前为 1200 行，覆盖结构化事实、DOCX RAG、行为 SQL、路线融合和边界拒答五类场景。当前可核验的最新报告为 `reports/full1200_multi_agent_review.json` / `reports/full1200_multi_agent_review.md`，层级为 full。</w:t>
+        <w:t>项目中 `tests/unified_eval_cases.jsonl` 主评测集当前为 1200 行，覆盖结构化事实、DOCX RAG、行为 SQL、路线融合和边界拒答五类场景。当前可核验的最新报告为 `reports/full1200_multi_agent_review.json` / `reports/</w:t>
+      </w:r>
+      <w:bookmarkStart w:id="27" w:name="_GoBack"/>
+      <w:bookmarkEnd w:id="27"/>
+      <w:r>
+        <w:t>full1200_multi_agent_review.md`，层级为 full。</w:t>
       </w:r>
     </w:p>
     <w:tbl>
@@ -11403,7 +11448,7 @@
       <w:tblGrid>
         <w:gridCol w:w="2232"/>
         <w:gridCol w:w="2232"/>
-        <w:gridCol w:w="4256"/>
+        <w:gridCol w:w="4749"/>
       </w:tblGrid>
       <w:tr>
         <w:tblPrEx>
@@ -11856,7 +11901,7 @@
         <w:keepNext/>
         <w:spacing w:before="160" w:after="120"/>
       </w:pPr>
-      <w:bookmarkStart w:id="25" w:name="_Toc28729"/>
+      <w:bookmarkStart w:id="24" w:name="_Toc28729"/>
       <w:r>
         <w:rPr>
           <w:rFonts w:ascii="微软雅黑" w:hAnsi="微软雅黑" w:eastAsia="微软雅黑" w:cs="微软雅黑"/>
@@ -11867,7 +11912,7 @@
         </w:rPr>
         <w:t>6.2 当前分项结果</w:t>
       </w:r>
-      <w:bookmarkEnd w:id="25"/>
+      <w:bookmarkEnd w:id="24"/>
     </w:p>
     <w:tbl>
       <w:tblPr>
@@ -12349,7 +12394,7 @@
         <w:keepNext/>
         <w:spacing w:before="160" w:after="120"/>
       </w:pPr>
-      <w:bookmarkStart w:id="26" w:name="_Toc702"/>
+      <w:bookmarkStart w:id="25" w:name="_Toc702"/>
       <w:r>
         <w:rPr>
           <w:rFonts w:ascii="微软雅黑" w:hAnsi="微软雅黑" w:eastAsia="微软雅黑" w:cs="微软雅黑"/>
@@ -12360,7 +12405,7 @@
         </w:rPr>
         <w:t>6.3 响应契约测试</w:t>
       </w:r>
-      <w:bookmarkEnd w:id="26"/>
+      <w:bookmarkEnd w:id="25"/>
     </w:p>
     <w:p>
       <w:pPr>
@@ -12393,7 +12438,6 @@
         </w:rPr>
         <w:t>7. 工程化成果</w:t>
       </w:r>
-      <w:bookmarkEnd w:id="27"/>
     </w:p>
     <w:p>
       <w:pPr>
@@ -12501,7 +12545,7 @@
         <w:keepNext/>
         <w:spacing w:before="240" w:after="120"/>
       </w:pPr>
-      <w:bookmarkStart w:id="28" w:name="_Toc24812"/>
+      <w:bookmarkStart w:id="26" w:name="_Toc24812"/>
       <w:r>
         <w:rPr>
           <w:rFonts w:ascii="微软雅黑" w:hAnsi="微软雅黑" w:eastAsia="微软雅黑" w:cs="微软雅黑"/>
@@ -12512,7 +12556,7 @@
         </w:rPr>
         <w:t>8. 项目总结与意义</w:t>
       </w:r>
-      <w:bookmarkEnd w:id="28"/>
+      <w:bookmarkEnd w:id="26"/>
     </w:p>
     <w:p>
       <w:pPr>

</xml_diff>